<commit_message>
Finalize 14-page manuscript typography and record fresh-checkout audit
</commit_message>
<xml_diff>
--- a/manuscript/Изменения_и_контрольный_аудит.docx
+++ b/manuscript/Изменения_и_контрольный_аудит.docx
@@ -38,7 +38,7 @@
           <w:rFonts w:ascii="Times New Roman" w:hAnsi="Times New Roman" w:eastAsia="Times New Roman" w:cs="Times New Roman"/>
           <w:color w:val="000000"/>
         </w:rPr>
-        <w:t>Сравнение с исходным файлом, предоставленным автором. Итоговая статья — 13 страниц при лимите 15; сохранены 8 таблиц, 6 рисунков и 8 нумерованных формул в 10 математических объектах Word.</w:t>
+        <w:t>Сравнение с исходным файлом, предоставленным автором. Итоговая статья — 14 страниц при лимите 15; сохранены 8 таблиц, 6 рисунков и 8 нумерованных формул в 10 математических объектах Word.</w:t>
       </w:r>
     </w:p>
     <w:tbl>
@@ -635,7 +635,7 @@
           <w:rFonts w:ascii="Times New Roman" w:hAnsi="Times New Roman" w:eastAsia="Times New Roman" w:cs="Times New Roman"/>
           <w:color w:val="000000"/>
         </w:rPr>
-        <w:t>Промежуточная аннотация на 150 слов заменена на 250; источники доведены до 20. Дочерние проверки запускаются в изолированном Python, чтобы настройки окружения не отключали assert. Отчёты получают числа из проверенных результатов.</w:t>
+        <w:t>Промежуточная аннотация на 150 слов заменена на 250; источники доведены до 20. Таблицы, подписи, примечания и библиография приведены к 12 pt. Дочерние проверки запускаются в изолированном Python, чтобы настройки окружения не отключали assert. Отчёты получают числа из проверенных результатов.</w:t>
       </w:r>
     </w:p>
     <w:p>

</xml_diff>